<commit_message>
updated documentation for consistency
</commit_message>
<xml_diff>
--- a/docs/design/DSR-1_Firmware_Reference.docx
+++ b/docs/design/DSR-1_Firmware_Reference.docx
@@ -85,7 +85,7 @@
           <w:sz w:val="22"/>
           <w:szCs w:val="22"/>
         </w:rPr>
-        <w:t xml:space="preserve">Revision 0.1  |  STM32G0B1KBU6  |  Bare-Metal C  |  MIT License</w:t>
+        <w:t xml:space="preserve">Revision 0.1  |  STM32G0C1KCU6  |  Bare-Metal C  |  MIT License</w:t>
       </w:r>
     </w:p>
     <w:p>
@@ -129,7 +129,7 @@
           <w:sz w:val="22"/>
           <w:szCs w:val="22"/>
         </w:rPr>
-        <w:t xml:space="preserve">The DSR-1 firmware replaces the failed capstan servo IC (Sony CX20084) in the WM-D6C professional cassette recorder with a digital PI servo loop running on an STM32G0B1KBU6 microcontroller. It also provides a USB CDC virtual COM port for live tuning and flash-backed persistent settings storage.</w:t>
+        <w:t xml:space="preserve">The DSR-1 firmware replaces the failed capstan servo IC (Sony CX20084) in the WM-D6C professional cassette recorder with a digital PI servo loop running on an STM32G0C1KCU6 microcontroller. It also provides a USB CDC virtual COM port for live tuning and flash-backed persistent settings storage.</w:t>
       </w:r>
     </w:p>
     <w:p>
@@ -373,7 +373,7 @@
                 <w:sz w:val="20"/>
                 <w:szCs w:val="20"/>
               </w:rPr>
-              <w:t xml:space="preserve">TIM2 input capture ISR, PI control law, DAC/PWM output, freeze/unfreeze</w:t>
+              <w:t xml:space="preserve">TIM2 input capture ISR, PI control law, PWM output, freeze/unfreeze</w:t>
             </w:r>
           </w:p>
         </w:tc>
@@ -693,7 +693,7 @@
                 <w:sz w:val="20"/>
                 <w:szCs w:val="20"/>
               </w:rPr>
-              <w:t xml:space="preserve">STM32G0B1KBUx_FLASH.ld</w:t>
+              <w:t xml:space="preserve">STM32G0C1KBUx_FLASH.ld</w:t>
             </w:r>
           </w:p>
         </w:tc>
@@ -2214,7 +2214,7 @@
           <w:sz w:val="22"/>
           <w:szCs w:val="22"/>
         </w:rPr>
-        <w:t xml:space="preserve">Define SERVO_OPTION_B to select the PWM + NPN level-shift output stage for machines where the Q601 base voltage exceeds 3.3 V. Leave undefined (default) for direct DAC drive.</w:t>
+        <w:t xml:space="preserve">Define SERVO_OPTION_B to select the PWM + NPN level-shift output stage for machines where the Q601 base voltage exceeds 3.3 V. Leave undefined (default) for PWM + NPN level-shift drive.</w:t>
       </w:r>
     </w:p>
     <w:p>
@@ -5124,7 +5124,7 @@
           <w:sz w:val="22"/>
           <w:szCs w:val="22"/>
         </w:rPr>
-        <w:t xml:space="preserve">Flash erase operations on the single-bank STM32G0B1 stall instruction fetch for ~2 ms. Without mitigation, the ISR would miss 4–5 FG edges, the integral would accumulate stale error, and the motor would receive a large correction spike on resumption.</w:t>
+        <w:t xml:space="preserve">Flash erase operations on the single-bank STM32G0C1 stall instruction fetch for ~2 ms. Without mitigation, the ISR would miss 4–5 FG edges, the integral would accumulate stale error, and the motor would receive a large correction spike on resumption.</w:t>
       </w:r>
     </w:p>
     <w:p>
@@ -5293,7 +5293,7 @@
                 <w:sz w:val="20"/>
                 <w:szCs w:val="20"/>
               </w:rPr>
-              <w:t xml:space="preserve">Disables TIM2 IRQ; clears integral; DAC output unchanged at last good value</w:t>
+              <w:t xml:space="preserve">Disables TIM2 IRQ; clears integral; PWM output unchanged at last good value</w:t>
             </w:r>
           </w:p>
         </w:tc>
@@ -6580,7 +6580,7 @@
           <w:sz w:val="22"/>
           <w:szCs w:val="22"/>
         </w:rPr>
-        <w:t xml:space="preserve">The settings block is 32 bytes, 8-byte aligned (required for STM32G0B1 double-word flash writes). It occupies the first 32 bytes of the last 2 KB page at 0x0801F000.</w:t>
+        <w:t xml:space="preserve">The settings block is 32 bytes, 8-byte aligned (required for STM32G0C1 double-word flash writes). It occupies the first 32 bytes of the last 2 KB page at 0x0801F000.</w:t>
       </w:r>
     </w:p>
     <w:p>
@@ -7382,7 +7382,7 @@
           <w:sz w:val="22"/>
           <w:szCs w:val="22"/>
         </w:rPr>
-        <w:t xml:space="preserve">The STM32G0B1 flash controller requires double-word (64-bit) writes — two consecutive 32-bit words must be written before the programming latch fires. Writing a single word and stopping leaves the cell in a partially programmed state.</w:t>
+        <w:t xml:space="preserve">The STM32G0C1 flash controller requires double-word (64-bit) writes — two consecutive 32-bit words must be written before the programming latch fires. Writing a single word and stopping leaves the cell in a partially programmed state.</w:t>
       </w:r>
     </w:p>
     <w:p>
@@ -7811,7 +7811,7 @@
           <w:sz w:val="22"/>
           <w:szCs w:val="22"/>
         </w:rPr>
-        <w:t xml:space="preserve">The STM32G0B1 implements crystal-less USB using an internal 48 MHz RC oscillator (HSI48) trimmed by the Clock Recovery System (CRS). The CRS measures HSI48 tick counts between USB SOF packets (sent by the host every 1.000 ms ±250 ppm) and automatically adjusts the HSI48 trim register to maintain accuracy within USB specification.</w:t>
+        <w:t xml:space="preserve">The STM32G0C1 implements crystal-less USB using an internal 48 MHz RC oscillator (HSI48) trimmed by the Clock Recovery System (CRS). The CRS measures HSI48 tick counts between USB SOF packets (sent by the host every 1.000 ms ±250 ppm) and automatically adjusts the HSI48 trim register to maintain accuracy within USB specification.</w:t>
       </w:r>
     </w:p>
     <w:p>
@@ -11955,7 +11955,7 @@
           <w:sz w:val="36"/>
           <w:szCs w:val="36"/>
         </w:rPr>
-        <w:t xml:space="preserve">9. STM32G0B1KBUx_FLASH.ld — Linker Script</w:t>
+        <w:t xml:space="preserve">9. STM32G0C1KBUx_FLASH.ld — Linker Script</w:t>
       </w:r>
     </w:p>
     <w:p>
@@ -14682,7 +14682,7 @@
           <w:sz w:val="22"/>
           <w:szCs w:val="22"/>
         </w:rPr>
-        <w:t xml:space="preserve"> Single-word writes to flash corrupt the cell on STM32G0B1.</w:t>
+        <w:t xml:space="preserve"> Single-word writes to flash corrupt the cell on STM32G0C1.</w:t>
       </w:r>
     </w:p>
     <w:p>

</xml_diff>